<commit_message>
Broaden BitcoinComputer and marketplace research descriptions
</commit_message>
<xml_diff>
--- a/applications/ode/Jacob_Nikolau_Ode_Resume.docx
+++ b/applications/ode/Jacob_Nikolau_Ode_Resume.docx
@@ -61,7 +61,7 @@
       <w:pPr>
         <w:keepNext/>
         <w:widowControl/>
-        <w:spacing w:before="140" w:after="80"/>
+        <w:spacing w:before="120" w:after="60"/>
       </w:pPr>
       <w:r>
         <w:rPr>
@@ -84,7 +84,7 @@
       <w:pPr>
         <w:keepNext/>
         <w:widowControl/>
-        <w:spacing w:before="140" w:after="80"/>
+        <w:spacing w:before="120" w:after="60"/>
       </w:pPr>
       <w:r>
         <w:rPr>
@@ -267,7 +267,7 @@
         <w:ind w:left="187" w:hanging="187"/>
       </w:pPr>
       <w:r>
-        <w:t>Wrote website messaging around JavaScript smart contracts for Bitcoin and mapped site content to technical and business evaluation; compared the platform with zkSync across architecture, security, and developer experience.</w:t>
+        <w:t>Translated Bitcoin Computer’s architecture into website and product messaging; produced decision-ready research spanning competing protocols, developer economics, compliance considerations, and applications including decentralized exchange, token issuance, and skill gaming.</w:t>
       </w:r>
     </w:p>
     <w:p>
@@ -339,7 +339,7 @@
       <w:pPr>
         <w:keepNext/>
         <w:widowControl/>
-        <w:spacing w:before="140" w:after="80"/>
+        <w:spacing w:before="120" w:after="60"/>
       </w:pPr>
       <w:r>
         <w:rPr>
@@ -523,7 +523,7 @@
       <w:pPr>
         <w:keepNext/>
         <w:widowControl/>
-        <w:spacing w:before="140" w:after="80"/>
+        <w:spacing w:before="120" w:after="60"/>
       </w:pPr>
       <w:r>
         <w:rPr>
@@ -663,7 +663,7 @@
         <w:ind w:left="187" w:hanging="187"/>
       </w:pPr>
       <w:r>
-        <w:t>Compute marketplace: Buyer/vendor workflows for fixed-price AI jobs with flexible deadlines, covering posting, claiming, delivery, and acceptance to explore the economics of work that can wait.</w:t>
+        <w:t>Compute marketplace: Prototyped fixed-price AI-job workflows and built a fact-checked 517-company dossier to test the thesis and map gaps in verification and recourse.</w:t>
       </w:r>
     </w:p>
     <w:p>
@@ -731,7 +731,7 @@
       <w:pPr>
         <w:keepNext/>
         <w:widowControl/>
-        <w:spacing w:before="140" w:after="80"/>
+        <w:spacing w:before="120" w:after="60"/>
       </w:pPr>
       <w:r>
         <w:rPr>
@@ -754,7 +754,7 @@
       <w:pPr>
         <w:keepNext/>
         <w:widowControl/>
-        <w:spacing w:before="140" w:after="80"/>
+        <w:spacing w:before="120" w:after="60"/>
       </w:pPr>
       <w:r>
         <w:rPr>

</xml_diff>

<commit_message>
Center resume on product understanding and customer value
</commit_message>
<xml_diff>
--- a/applications/ode/Jacob_Nikolau_Ode_Resume.docx
+++ b/applications/ode/Jacob_Nikolau_Ode_Resume.docx
@@ -77,7 +77,7 @@
         <w:widowControl/>
       </w:pPr>
       <w:r>
-        <w:t>Product marketer for AI and technical B2B software, twice the first marketer at a startup. I work closely with CEOs and customers to understand their businesses and shape commercial strategy. I also build with AI, from customer research workflows to model evaluations. Getting complex technology to land clearly, for the people building it and the people buying it, is the work I care about most.</w:t>
+        <w:t>Product marketer for AI and enterprise software, twice the first marketer at a startup. I work with CEOs, product teams, and customers to reconcile product capabilities and internal expectations with market realities and the needs of an individual account. I build frameworks, narratives, and customer evidence that help people agree on goals, set expectations, and recognize results. I love working through that complexity and helping customers make the case for the value they get.</w:t>
       </w:r>
     </w:p>
     <w:p>
@@ -130,7 +130,7 @@
         <w:ind w:left="187" w:hanging="187"/>
       </w:pPr>
       <w:r>
-        <w:t>Built Claude skills to extract objections, competitive mentions, and customer evidence from sales calls, reducing case-study production from 50 hours to 5 using a RevOps-built Gong/Salesforce integration.</w:t>
+        <w:t>Built Claude skills to turn sales-call objections, competitor mentions, and customer outcomes into reusable evidence, reducing case-study production from 50 hours to 5 using a RevOps-built Gong/Salesforce integration.</w:t>
       </w:r>
     </w:p>
     <w:p>
@@ -141,7 +141,7 @@
         <w:ind w:left="187" w:hanging="187"/>
       </w:pPr>
       <w:r>
-        <w:t>Founded the Manage Better Board, a 21-member customer advisory community for architecture and engineering operators; ran six executive roundtables and industry sessions featuring customer speakers.</w:t>
+        <w:t>Positioned Chello, Mosaic’s AI resource-management agent, around operations leaders’ priorities; created sales talk tracks distinguishing live capabilities from roadmap commitments.</w:t>
       </w:r>
     </w:p>
     <w:p>
@@ -152,7 +152,18 @@
         <w:ind w:left="187" w:hanging="187"/>
       </w:pPr>
       <w:r>
-        <w:t>Published six customer-approved case studies, each with an ROI calculation translating product use into business value.</w:t>
+        <w:t>Founded the 21-member Manage Better Board for architecture and engineering operators; ran six executive roundtables and industry sessions where customers shared workflows and results.</w:t>
+      </w:r>
+    </w:p>
+    <w:p>
+      <w:pPr>
+        <w:pStyle w:val="ListBullet"/>
+        <w:widowControl/>
+        <w:spacing w:after="60"/>
+        <w:ind w:left="187" w:hanging="187"/>
+      </w:pPr>
+      <w:r>
+        <w:t>Worked with customers on six approved case studies with ROI calculations, giving customers and sales teams evidence to explain business value.</w:t>
       </w:r>
     </w:p>
     <w:p>
@@ -196,18 +207,7 @@
         <w:ind w:left="187" w:hanging="187"/>
       </w:pPr>
       <w:r>
-        <w:t>Owned positioning and messaging for Mosaic’s AI resource-management agent, Chello, translating capabilities into stories for operations leaders and executives. Created sales talk tracks that distinguished live functionality from roadmap commitments.</w:t>
-      </w:r>
-    </w:p>
-    <w:p>
-      <w:pPr>
-        <w:pStyle w:val="ListBullet"/>
-        <w:widowControl/>
-        <w:spacing w:after="60"/>
-        <w:ind w:left="187" w:hanging="187"/>
-      </w:pPr>
-      <w:r>
-        <w:t>Directed AI-assisted research across 13 architecture, engineering, and construction sub-industries; recommended sector-specific targeting instead of a broad AEC pitch and built a sales-development playbook with observable prospect signals.</w:t>
+        <w:t>Directed AI-assisted research across 13 architecture, engineering, and construction sub-industries; recommended sector-specific positioning and built a sales-development playbook grounded in observable prospect signals.</w:t>
       </w:r>
     </w:p>
     <w:p>
@@ -267,7 +267,7 @@
         <w:ind w:left="187" w:hanging="187"/>
       </w:pPr>
       <w:r>
-        <w:t>Translated Bitcoin Computer’s architecture into website and product messaging; produced decision-ready research spanning competing protocols, developer economics, compliance considerations, and applications including decentralized exchange, token issuance, and skill gaming.</w:t>
+        <w:t>Translated the platform’s architecture into website content for technical and business evaluation; researched competing protocols and regulatory considerations for skill gaming to clarify product tradeoffs.</w:t>
       </w:r>
     </w:p>
     <w:p>
@@ -316,7 +316,7 @@
         <w:ind w:left="187" w:hanging="187"/>
       </w:pPr>
       <w:r>
-        <w:t>Led product marketing for a platform with 12–24-month enterprise sales cycles and regulated buyers including Goldman Sachs and Capital Group.</w:t>
+        <w:t>Built messaging and features-to-value frameworks for business buyers and technical evaluators in 12–24-month sales cycles, including regulated accounts such as Goldman Sachs and Capital Group.</w:t>
       </w:r>
     </w:p>
     <w:p>
@@ -327,7 +327,18 @@
         <w:ind w:left="187" w:hanging="187"/>
       </w:pPr>
       <w:r>
-        <w:t>Built a customer-story and reference program across 15 enterprise customers; arranged for Marriott’s CHRO to present the engagement on the main stage at Josh Bersin’s conference.</w:t>
+        <w:t>Built a customer-story and reference program across 15 enterprise customers and managed customer legal approvals; arranged for Marriott’s CHRO to present the engagement at Josh Bersin’s conference.</w:t>
+      </w:r>
+    </w:p>
+    <w:p>
+      <w:pPr>
+        <w:pStyle w:val="ListBullet"/>
+        <w:widowControl/>
+        <w:spacing w:after="60"/>
+        <w:ind w:left="187" w:hanging="187"/>
+      </w:pPr>
+      <w:r>
+        <w:t>Ran analyst relations with Gartner and Forrester; earned a Craig Weiss Top 10 Learning Systems placement.</w:t>
       </w:r>
     </w:p>
     <w:p>
@@ -396,7 +407,7 @@
         <w:ind w:left="187" w:hanging="187"/>
       </w:pPr>
       <w:r>
-        <w:t>Designed customer ROI research with Cascade Insights, including six executive interviews and a 127-person survey; turned findings into proof points and a value framework for Sales and Customer Success.</w:t>
+        <w:t>Designed ROI research with Cascade Insights, including six executive interviews and a 127-person survey; translated customer-reported outcomes into a shared value framework for Sales and Customer Success.</w:t>
       </w:r>
     </w:p>
     <w:p>
@@ -407,7 +418,7 @@
         <w:ind w:left="187" w:hanging="187"/>
       </w:pPr>
       <w:r>
-        <w:t>Ran customer-led webinars and ebooks that were the first conversion point for 33% of marketing-qualified leads and 21% of sales-qualified leads.</w:t>
+        <w:t>Helped customers explain their experiences through webinars and ebooks that were the first conversion point for 33% of marketing-qualified leads and 21% of sales-qualified leads.</w:t>
       </w:r>
     </w:p>
     <w:p>
@@ -467,7 +478,7 @@
         <w:ind w:left="187" w:hanging="187"/>
       </w:pPr>
       <w:r>
-        <w:t>Ran customer webinars with large enterprises and built live product demonstrations; developed a co-branded webinar program with Google.</w:t>
+        <w:t>Helped enterprise customers explain their use of AI simulation through webinars and live demonstrations; developed a co-branded webinar program with Google.</w:t>
       </w:r>
     </w:p>
     <w:p>
@@ -552,7 +563,7 @@
         <w:widowControl/>
       </w:pPr>
       <w:r>
-        <w:t>Built self-directed tools and prototypes with Claude Code and Codex to understand unfamiliar businesses, explore AI tradeoffs, and improve customer and marketing workflows.</w:t>
+        <w:t>Built self-directed tools and prototypes with Claude Code and Codex to understand how products work, make their value tangible, and turn customer conversations into usable evidence.</w:t>
       </w:r>
     </w:p>
     <w:p>
@@ -663,7 +674,7 @@
         <w:ind w:left="187" w:hanging="187"/>
       </w:pPr>
       <w:r>
-        <w:t>Compute marketplace: Prototyped fixed-price AI-job workflows and built a fact-checked 517-company dossier to test the thesis and map gaps in verification and recourse.</w:t>
+        <w:t>Compute marketplace: Fixed-price AI-job workflows and a 517-company competitive dossier testing the business case for verified results and buyer recourse.</w:t>
       </w:r>
     </w:p>
     <w:p>
@@ -747,7 +758,7 @@
         <w:widowControl/>
       </w:pPr>
       <w:r>
-        <w:t>Positioning, customer research, market sizing, competitive analysis, go-to-market strategy, agent workflows, model evaluation. Claude, Claude Code, Codex, Gong, Salesforce, HubSpot.</w:t>
+        <w:t>Positioning, value frameworks, customer research and advocacy, market sizing, competitive analysis, AI workflows, model evaluation. Claude, Claude Code, Codex, Gong, Salesforce, HubSpot.</w:t>
       </w:r>
     </w:p>
     <w:p>

</xml_diff>

<commit_message>
Restore resume proof links across PDF Word and Markdown
</commit_message>
<xml_diff>
--- a/applications/ode/Jacob_Nikolau_Ode_Resume.docx
+++ b/applications/ode/Jacob_Nikolau_Ode_Resume.docx
@@ -51,11 +51,6 @@
           <w:t>github.com/NYCandrun</w:t>
         </w:r>
       </w:hyperlink>
-      <w:r>
-        <w:rPr>
-          <w:sz w:val="19"/>
-        </w:rPr>
-      </w:r>
     </w:p>
     <w:p>
       <w:pPr>
@@ -163,7 +158,85 @@
         <w:ind w:left="187" w:hanging="187"/>
       </w:pPr>
       <w:r>
-        <w:t>Worked with customers on six approved case studies with ROI calculations, giving customers and sales teams evidence to explain business value.</w:t>
+        <w:t xml:space="preserve">Worked with </w:t>
+      </w:r>
+      <w:hyperlink r:id="rId10">
+        <w:r>
+          <w:rPr>
+            <w:sz w:val="21"/>
+            <w:color w:val="243B53"/>
+            <w:u w:val="single"/>
+          </w:rPr>
+          <w:t>AssistRx</w:t>
+        </w:r>
+      </w:hyperlink>
+      <w:r>
+        <w:t xml:space="preserve">, </w:t>
+      </w:r>
+      <w:hyperlink r:id="rId11">
+        <w:r>
+          <w:rPr>
+            <w:sz w:val="21"/>
+            <w:color w:val="243B53"/>
+            <w:u w:val="single"/>
+          </w:rPr>
+          <w:t>CetraRuddy</w:t>
+        </w:r>
+      </w:hyperlink>
+      <w:r>
+        <w:t xml:space="preserve">, </w:t>
+      </w:r>
+      <w:hyperlink r:id="rId12">
+        <w:r>
+          <w:rPr>
+            <w:sz w:val="21"/>
+            <w:color w:val="243B53"/>
+            <w:u w:val="single"/>
+          </w:rPr>
+          <w:t>Stahly Engineering</w:t>
+        </w:r>
+      </w:hyperlink>
+      <w:r>
+        <w:t xml:space="preserve">, </w:t>
+      </w:r>
+      <w:hyperlink r:id="rId13">
+        <w:r>
+          <w:rPr>
+            <w:sz w:val="21"/>
+            <w:color w:val="243B53"/>
+            <w:u w:val="single"/>
+          </w:rPr>
+          <w:t>CESO</w:t>
+        </w:r>
+      </w:hyperlink>
+      <w:r>
+        <w:t xml:space="preserve">, </w:t>
+      </w:r>
+      <w:hyperlink r:id="rId14">
+        <w:r>
+          <w:rPr>
+            <w:sz w:val="21"/>
+            <w:color w:val="243B53"/>
+            <w:u w:val="single"/>
+          </w:rPr>
+          <w:t>Clark Patterson Lee</w:t>
+        </w:r>
+      </w:hyperlink>
+      <w:r>
+        <w:t xml:space="preserve">, and </w:t>
+      </w:r>
+      <w:hyperlink r:id="rId15">
+        <w:r>
+          <w:rPr>
+            <w:sz w:val="21"/>
+            <w:color w:val="243B53"/>
+            <w:u w:val="single"/>
+          </w:rPr>
+          <w:t>Vocon</w:t>
+        </w:r>
+      </w:hyperlink>
+      <w:r>
+        <w:t xml:space="preserve"> on approved case studies with ROI calculations, giving customers and sales teams evidence to explain business value.</w:t>
       </w:r>
     </w:p>
     <w:p>
@@ -218,7 +291,20 @@
         <w:ind w:left="187" w:hanging="187"/>
       </w:pPr>
       <w:r>
-        <w:t>Designed and fielded a 138-person survey and co-authored The State of AI in A&amp;E 2026, examining AI adoption among architecture and engineering professionals.</w:t>
+        <w:t xml:space="preserve">Designed and fielded a 138-person survey and co-authored </w:t>
+      </w:r>
+      <w:hyperlink r:id="rId16">
+        <w:r>
+          <w:rPr>
+            <w:sz w:val="21"/>
+            <w:color w:val="243B53"/>
+            <w:u w:val="single"/>
+          </w:rPr>
+          <w:t>The State of AI in A&amp;E 2026</w:t>
+        </w:r>
+      </w:hyperlink>
+      <w:r>
+        <w:t>, examining AI adoption among architecture and engineering professionals.</w:t>
       </w:r>
     </w:p>
     <w:p>
@@ -429,7 +515,33 @@
         <w:ind w:left="187" w:hanging="187"/>
       </w:pPr>
       <w:r>
-        <w:t>Authored research with Executive Networks based on a survey of 515 learning leaders across five countries, earning coverage in HR Dive and TD Magazine.</w:t>
+        <w:t xml:space="preserve">Authored research with Executive Networks based on a survey of 515 learning leaders across five countries, earning coverage in </w:t>
+      </w:r>
+      <w:hyperlink r:id="rId17">
+        <w:r>
+          <w:rPr>
+            <w:sz w:val="21"/>
+            <w:color w:val="243B53"/>
+            <w:u w:val="single"/>
+          </w:rPr>
+          <w:t>HR Dive</w:t>
+        </w:r>
+      </w:hyperlink>
+      <w:r>
+        <w:t xml:space="preserve"> and </w:t>
+      </w:r>
+      <w:hyperlink r:id="rId18">
+        <w:r>
+          <w:rPr>
+            <w:sz w:val="21"/>
+            <w:color w:val="243B53"/>
+            <w:u w:val="single"/>
+          </w:rPr>
+          <w:t>TD Magazine</w:t>
+        </w:r>
+      </w:hyperlink>
+      <w:r>
+        <w:t>.</w:t>
       </w:r>
     </w:p>
     <w:p>
@@ -489,7 +601,33 @@
         <w:ind w:left="187" w:hanging="187"/>
       </w:pPr>
       <w:r>
-        <w:t>Authored research with Future Workplace based on a survey of 300 corporate learning leaders; Harvard Business Review built an article around the findings, and Forbes cited the study.</w:t>
+        <w:t xml:space="preserve">Authored research with Future Workplace based on a survey of 300 corporate learning leaders; </w:t>
+      </w:r>
+      <w:hyperlink r:id="rId19">
+        <w:r>
+          <w:rPr>
+            <w:sz w:val="21"/>
+            <w:color w:val="243B53"/>
+            <w:u w:val="single"/>
+          </w:rPr>
+          <w:t>Harvard Business Review</w:t>
+        </w:r>
+      </w:hyperlink>
+      <w:r>
+        <w:t xml:space="preserve"> built an article around the findings, and </w:t>
+      </w:r>
+      <w:hyperlink r:id="rId20">
+        <w:r>
+          <w:rPr>
+            <w:sz w:val="21"/>
+            <w:color w:val="243B53"/>
+            <w:u w:val="single"/>
+          </w:rPr>
+          <w:t>Forbes</w:t>
+        </w:r>
+      </w:hyperlink>
+      <w:r>
+        <w:t xml:space="preserve"> cited the study.</w:t>
       </w:r>
     </w:p>
     <w:p>
@@ -573,8 +711,7 @@
         <w:spacing w:after="60"/>
         <w:ind w:left="187" w:hanging="187"/>
       </w:pPr>
-      <w:r/>
-      <w:hyperlink r:id="rId10">
+      <w:hyperlink r:id="rId21">
         <w:r>
           <w:rPr>
             <w:sz w:val="21"/>
@@ -585,9 +722,6 @@
         </w:r>
       </w:hyperlink>
       <w:r>
-        <w:rPr>
-          <w:sz w:val="21"/>
-        </w:rPr>
         <w:t>: Desktop Gong/Grain transcript downloader and Markdown merger, plus case-study agents that organize conversations by account, preserve source attribution, and produce drafts and quote exports.</w:t>
       </w:r>
     </w:p>
@@ -598,8 +732,7 @@
         <w:spacing w:after="60"/>
         <w:ind w:left="187" w:hanging="187"/>
       </w:pPr>
-      <w:r/>
-      <w:hyperlink r:id="rId11">
+      <w:hyperlink r:id="rId22">
         <w:r>
           <w:rPr>
             <w:sz w:val="21"/>
@@ -610,9 +743,6 @@
         </w:r>
       </w:hyperlink>
       <w:r>
-        <w:rPr>
-          <w:sz w:val="21"/>
-        </w:rPr>
         <w:t>: Liquid AI-inspired games and demos exploring on-device versus cloud AI, plus an Ashby-inspired recruiting game showing how data quality shapes decisions.</w:t>
       </w:r>
     </w:p>
@@ -623,8 +753,7 @@
         <w:spacing w:after="60"/>
         <w:ind w:left="187" w:hanging="187"/>
       </w:pPr>
-      <w:r/>
-      <w:hyperlink r:id="rId12">
+      <w:hyperlink r:id="rId23">
         <w:r>
           <w:rPr>
             <w:sz w:val="21"/>
@@ -635,9 +764,6 @@
         </w:r>
       </w:hyperlink>
       <w:r>
-        <w:rPr>
-          <w:sz w:val="21"/>
-        </w:rPr>
         <w:t>: Interactive lessons and executive briefings translating public API specifications and product research into an explanation of the platform and its business value.</w:t>
       </w:r>
     </w:p>
@@ -648,8 +774,7 @@
         <w:spacing w:after="60"/>
         <w:ind w:left="187" w:hanging="187"/>
       </w:pPr>
-      <w:r/>
-      <w:hyperlink r:id="rId13">
+      <w:hyperlink r:id="rId24">
         <w:r>
           <w:rPr>
             <w:sz w:val="21"/>
@@ -660,9 +785,6 @@
         </w:r>
       </w:hyperlink>
       <w:r>
-        <w:rPr>
-          <w:sz w:val="21"/>
-        </w:rPr>
         <w:t>: Desktop learning app combining Claude-generated lessons and quizzes with prerequisite progression, mastery tracking, and spaced review, from algebra through astrophysics.</w:t>
       </w:r>
     </w:p>
@@ -684,8 +806,7 @@
         <w:spacing w:after="60"/>
         <w:ind w:left="187" w:hanging="187"/>
       </w:pPr>
-      <w:r/>
-      <w:hyperlink r:id="rId14">
+      <w:hyperlink r:id="rId25">
         <w:r>
           <w:rPr>
             <w:sz w:val="21"/>
@@ -696,9 +817,6 @@
         </w:r>
       </w:hyperlink>
       <w:r>
-        <w:rPr>
-          <w:sz w:val="21"/>
-        </w:rPr>
         <w:t>: Source collection, citation checks, and independent review for company briefs, with controls that stop completion when required evidence is missing.</w:t>
       </w:r>
     </w:p>
@@ -720,8 +838,7 @@
         <w:spacing w:after="60"/>
         <w:ind w:left="187" w:hanging="187"/>
       </w:pPr>
-      <w:r/>
-      <w:hyperlink r:id="rId15">
+      <w:hyperlink r:id="rId26">
         <w:r>
           <w:rPr>
             <w:sz w:val="21"/>
@@ -732,9 +849,6 @@
         </w:r>
       </w:hyperlink>
       <w:r>
-        <w:rPr>
-          <w:sz w:val="21"/>
-        </w:rPr>
         <w:t>: Automated job discovery, filtering, AI enrichment, and Webflow publishing, with stale-listing handling and a desktop monitoring app.</w:t>
       </w:r>
     </w:p>

</xml_diff>

<commit_message>
Highlight cross-industry experience and apply approved summary
</commit_message>
<xml_diff>
--- a/applications/ode/Jacob_Nikolau_Ode_Resume.docx
+++ b/applications/ode/Jacob_Nikolau_Ode_Resume.docx
@@ -72,7 +72,7 @@
         <w:widowControl/>
       </w:pPr>
       <w:r>
-        <w:t>Product marketer for AI and enterprise software. I’ve been the first marketer at two startups, working closely with CEOs, product teams, and customers. I help the people building, selling, and using a product agree on what it can do, why a customer would choose it, and what success looks like. I love that work, especially helping customers show the results and make the case for the product inside their own companies.</w:t>
+        <w:t>Product marketer with eight years in enterprise and AI software. I help product teams and executives agree on which customer problems their software can solve and what they can promise buyers. I work directly with customers to understand how they use the product and document the results. I turn those results into case studies and sales materials that help customers justify their investment and help sales win new business. I also build AI tools and prototypes to learn what the technology can actually do.</w:t>
       </w:r>
     </w:p>
     <w:p>
@@ -121,7 +121,7 @@
       <w:pPr>
         <w:pStyle w:val="ListBullet"/>
         <w:widowControl/>
-        <w:spacing w:after="60"/>
+        <w:spacing w:after="30"/>
         <w:ind w:left="187" w:hanging="187"/>
       </w:pPr>
       <w:r>
@@ -132,7 +132,7 @@
       <w:pPr>
         <w:pStyle w:val="ListBullet"/>
         <w:widowControl/>
-        <w:spacing w:after="60"/>
+        <w:spacing w:after="30"/>
         <w:ind w:left="187" w:hanging="187"/>
       </w:pPr>
       <w:r>
@@ -143,7 +143,7 @@
       <w:pPr>
         <w:pStyle w:val="ListBullet"/>
         <w:widowControl/>
-        <w:spacing w:after="60"/>
+        <w:spacing w:after="30"/>
         <w:ind w:left="187" w:hanging="187"/>
       </w:pPr>
       <w:r>
@@ -154,7 +154,7 @@
       <w:pPr>
         <w:pStyle w:val="ListBullet"/>
         <w:widowControl/>
-        <w:spacing w:after="60"/>
+        <w:spacing w:after="30"/>
         <w:ind w:left="187" w:hanging="187"/>
       </w:pPr>
       <w:r>
@@ -243,7 +243,7 @@
       <w:pPr>
         <w:pStyle w:val="ListBullet"/>
         <w:widowControl/>
-        <w:spacing w:after="60"/>
+        <w:spacing w:after="30"/>
         <w:ind w:left="187" w:hanging="187"/>
       </w:pPr>
       <w:r>
@@ -254,7 +254,7 @@
       <w:pPr>
         <w:pStyle w:val="ListBullet"/>
         <w:widowControl/>
-        <w:spacing w:after="60"/>
+        <w:spacing w:after="30"/>
         <w:ind w:left="187" w:hanging="187"/>
       </w:pPr>
       <w:r>
@@ -265,7 +265,7 @@
       <w:pPr>
         <w:pStyle w:val="ListBullet"/>
         <w:widowControl/>
-        <w:spacing w:after="60"/>
+        <w:spacing w:after="30"/>
         <w:ind w:left="187" w:hanging="187"/>
       </w:pPr>
       <w:r>
@@ -276,7 +276,7 @@
       <w:pPr>
         <w:pStyle w:val="ListBullet"/>
         <w:widowControl/>
-        <w:spacing w:after="60"/>
+        <w:spacing w:after="30"/>
         <w:ind w:left="187" w:hanging="187"/>
       </w:pPr>
       <w:r>
@@ -287,7 +287,7 @@
       <w:pPr>
         <w:pStyle w:val="ListBullet"/>
         <w:widowControl/>
-        <w:spacing w:after="60"/>
+        <w:spacing w:after="30"/>
         <w:ind w:left="187" w:hanging="187"/>
       </w:pPr>
       <w:r>
@@ -338,7 +338,7 @@
       <w:pPr>
         <w:pStyle w:val="ListBullet"/>
         <w:widowControl/>
-        <w:spacing w:after="60"/>
+        <w:spacing w:after="30"/>
         <w:ind w:left="187" w:hanging="187"/>
       </w:pPr>
       <w:r>
@@ -349,7 +349,7 @@
       <w:pPr>
         <w:pStyle w:val="ListBullet"/>
         <w:widowControl/>
-        <w:spacing w:after="60"/>
+        <w:spacing w:after="30"/>
         <w:ind w:left="187" w:hanging="187"/>
       </w:pPr>
       <w:r>
@@ -387,7 +387,7 @@
       <w:pPr>
         <w:pStyle w:val="ListBullet"/>
         <w:widowControl/>
-        <w:spacing w:after="60"/>
+        <w:spacing w:after="30"/>
         <w:ind w:left="187" w:hanging="187"/>
       </w:pPr>
       <w:r>
@@ -398,7 +398,7 @@
       <w:pPr>
         <w:pStyle w:val="ListBullet"/>
         <w:widowControl/>
-        <w:spacing w:after="60"/>
+        <w:spacing w:after="30"/>
         <w:ind w:left="187" w:hanging="187"/>
       </w:pPr>
       <w:r>
@@ -409,7 +409,7 @@
       <w:pPr>
         <w:pStyle w:val="ListBullet"/>
         <w:widowControl/>
-        <w:spacing w:after="60"/>
+        <w:spacing w:after="30"/>
         <w:ind w:left="187" w:hanging="187"/>
       </w:pPr>
       <w:r>
@@ -420,7 +420,7 @@
       <w:pPr>
         <w:pStyle w:val="ListBullet"/>
         <w:widowControl/>
-        <w:spacing w:after="60"/>
+        <w:spacing w:after="30"/>
         <w:ind w:left="187" w:hanging="187"/>
       </w:pPr>
       <w:r>
@@ -478,18 +478,18 @@
       <w:pPr>
         <w:pStyle w:val="ListBullet"/>
         <w:widowControl/>
-        <w:spacing w:after="60"/>
+        <w:spacing w:after="30"/>
         <w:ind w:left="187" w:hanging="187"/>
       </w:pPr>
       <w:r>
-        <w:t>Developed vertical positioning and packaging for financial services, energy, manufacturing, and hospitality, informed by a jointly built market-sizing model estimating a ~$9B TAM and ~$1.4B mid-market opportunity.</w:t>
+        <w:t>Developed industry-specific positioning and packaging across manufacturing, hospitality, financial services, technology, healthcare, and energy. Co-built a market-sizing model estimating a ~$9B TAM and ~$1.4B mid-market opportunity.</w:t>
       </w:r>
     </w:p>
     <w:p>
       <w:pPr>
         <w:pStyle w:val="ListBullet"/>
         <w:widowControl/>
-        <w:spacing w:after="60"/>
+        <w:spacing w:after="30"/>
         <w:ind w:left="187" w:hanging="187"/>
       </w:pPr>
       <w:r>
@@ -500,7 +500,7 @@
       <w:pPr>
         <w:pStyle w:val="ListBullet"/>
         <w:widowControl/>
-        <w:spacing w:after="60"/>
+        <w:spacing w:after="30"/>
         <w:ind w:left="187" w:hanging="187"/>
       </w:pPr>
       <w:r>
@@ -511,7 +511,7 @@
       <w:pPr>
         <w:pStyle w:val="ListBullet"/>
         <w:widowControl/>
-        <w:spacing w:after="60"/>
+        <w:spacing w:after="30"/>
         <w:ind w:left="187" w:hanging="187"/>
       </w:pPr>
       <w:r>
@@ -575,18 +575,18 @@
       <w:pPr>
         <w:pStyle w:val="ListBullet"/>
         <w:widowControl/>
-        <w:spacing w:after="60"/>
+        <w:spacing w:after="30"/>
         <w:ind w:left="187" w:hanging="187"/>
       </w:pPr>
       <w:r>
-        <w:t>Built the healthcare vertical go-to-market from scratch and landed Duke University Health System; ranked first on the team in new opportunities created and was fastest to reach $3M in attributed pipeline.</w:t>
+        <w:t>Developed go-to-market strategies across technology, healthcare, hospitality, consumer financial services, and call-center use cases. Built the healthcare vertical from scratch and landed Duke University Health System; ranked first on the team in new opportunities created and was fastest to reach $3M in attributed pipeline.</w:t>
       </w:r>
     </w:p>
     <w:p>
       <w:pPr>
         <w:pStyle w:val="ListBullet"/>
         <w:widowControl/>
-        <w:spacing w:after="60"/>
+        <w:spacing w:after="30"/>
         <w:ind w:left="187" w:hanging="187"/>
       </w:pPr>
       <w:r>
@@ -597,7 +597,7 @@
       <w:pPr>
         <w:pStyle w:val="ListBullet"/>
         <w:widowControl/>
-        <w:spacing w:after="60"/>
+        <w:spacing w:after="30"/>
         <w:ind w:left="187" w:hanging="187"/>
       </w:pPr>
       <w:r>
@@ -661,7 +661,7 @@
       <w:pPr>
         <w:pStyle w:val="ListBullet"/>
         <w:widowControl/>
-        <w:spacing w:after="60"/>
+        <w:spacing w:after="30"/>
         <w:ind w:left="187" w:hanging="187"/>
       </w:pPr>
       <w:r>
@@ -708,7 +708,7 @@
       <w:pPr>
         <w:pStyle w:val="ListBullet"/>
         <w:widowControl/>
-        <w:spacing w:after="60"/>
+        <w:spacing w:after="30"/>
         <w:ind w:left="187" w:hanging="187"/>
       </w:pPr>
       <w:hyperlink r:id="rId21">
@@ -729,7 +729,7 @@
       <w:pPr>
         <w:pStyle w:val="ListBullet"/>
         <w:widowControl/>
-        <w:spacing w:after="60"/>
+        <w:spacing w:after="30"/>
         <w:ind w:left="187" w:hanging="187"/>
       </w:pPr>
       <w:hyperlink r:id="rId22">
@@ -750,7 +750,7 @@
       <w:pPr>
         <w:pStyle w:val="ListBullet"/>
         <w:widowControl/>
-        <w:spacing w:after="60"/>
+        <w:spacing w:after="30"/>
         <w:ind w:left="187" w:hanging="187"/>
       </w:pPr>
       <w:hyperlink r:id="rId23">
@@ -771,7 +771,7 @@
       <w:pPr>
         <w:pStyle w:val="ListBullet"/>
         <w:widowControl/>
-        <w:spacing w:after="60"/>
+        <w:spacing w:after="30"/>
         <w:ind w:left="187" w:hanging="187"/>
       </w:pPr>
       <w:hyperlink r:id="rId24">
@@ -792,7 +792,7 @@
       <w:pPr>
         <w:pStyle w:val="ListBullet"/>
         <w:widowControl/>
-        <w:spacing w:after="60"/>
+        <w:spacing w:after="30"/>
         <w:ind w:left="187" w:hanging="187"/>
       </w:pPr>
       <w:r>
@@ -803,7 +803,7 @@
       <w:pPr>
         <w:pStyle w:val="ListBullet"/>
         <w:widowControl/>
-        <w:spacing w:after="60"/>
+        <w:spacing w:after="30"/>
         <w:ind w:left="187" w:hanging="187"/>
       </w:pPr>
       <w:hyperlink r:id="rId25">
@@ -824,7 +824,7 @@
       <w:pPr>
         <w:pStyle w:val="ListBullet"/>
         <w:widowControl/>
-        <w:spacing w:after="60"/>
+        <w:spacing w:after="30"/>
         <w:ind w:left="187" w:hanging="187"/>
       </w:pPr>
       <w:r>
@@ -835,7 +835,7 @@
       <w:pPr>
         <w:pStyle w:val="ListBullet"/>
         <w:widowControl/>
-        <w:spacing w:after="60"/>
+        <w:spacing w:after="30"/>
         <w:ind w:left="187" w:hanging="187"/>
       </w:pPr>
       <w:hyperlink r:id="rId26">

</xml_diff>

<commit_message>
Apply focused Ode edits while preserving original resume copy
</commit_message>
<xml_diff>
--- a/applications/ode/Jacob_Nikolau_Ode_Resume.docx
+++ b/applications/ode/Jacob_Nikolau_Ode_Resume.docx
@@ -72,7 +72,7 @@
         <w:widowControl/>
       </w:pPr>
       <w:r>
-        <w:t>Product marketer with eight years in enterprise and AI software. I help product teams and executives agree on which customer problems their software can solve and what they can promise buyers. I work directly with customers to understand how they use the product and document the results. I turn those results into case studies and sales materials that help customers justify their investment and help sales win new business. I also build AI tools and prototypes to learn what the technology can actually do.</w:t>
+        <w:t>Product marketer with eight years in enterprise and AI software. I research industries and work directly with customers to understand which business problems a product can solve. I help executives choose where to focus and help sales teams make the case to enterprise buyers. I’ve been the first marketer at two startups. At NovoEd, I designed ROI research using six executive interviews and a 127-person survey. At Mosaic, I built Claude workflows that cut case-study production from 50 hours to five. I also build AI prototypes and test models to understand their capabilities and limits.</w:t>
       </w:r>
     </w:p>
     <w:p>
@@ -136,7 +136,18 @@
         <w:ind w:left="187" w:hanging="187"/>
       </w:pPr>
       <w:r>
-        <w:t>Positioned Chello, Mosaic’s AI resource-management agent, around operations leaders’ priorities; created sales talk tracks distinguishing live capabilities from roadmap commitments.</w:t>
+        <w:t>Directed AI-assisted research across 13 architecture, engineering, and construction sub-industries; recommended sector-specific positioning and built a sales-development playbook grounded in observable prospect signals.</w:t>
+      </w:r>
+    </w:p>
+    <w:p>
+      <w:pPr>
+        <w:pStyle w:val="ListBullet"/>
+        <w:widowControl/>
+        <w:spacing w:after="30"/>
+        <w:ind w:left="187" w:hanging="187"/>
+      </w:pPr>
+      <w:r>
+        <w:t>Managed approximately $130K in quarterly media and sponsorship spend; shifted budget toward webinars after finding that their cost per sales-accepted opportunity was 83% lower than paid digital.</w:t>
       </w:r>
     </w:p>
     <w:p>
@@ -148,6 +159,17 @@
       </w:pPr>
       <w:r>
         <w:t>Founded the 21-member Manage Better Board for architecture and engineering operators; ran six executive roundtables and industry sessions where customers shared workflows and results.</w:t>
+      </w:r>
+    </w:p>
+    <w:p>
+      <w:pPr>
+        <w:pStyle w:val="ListBullet"/>
+        <w:widowControl/>
+        <w:spacing w:after="30"/>
+        <w:ind w:left="187" w:hanging="187"/>
+      </w:pPr>
+      <w:r>
+        <w:t>Positioned Chello, Mosaic’s AI resource-management agent, around operations leaders’ priorities; created sales talk tracks distinguishing live capabilities from roadmap commitments.</w:t>
       </w:r>
     </w:p>
     <w:p>
@@ -269,28 +291,6 @@
         <w:ind w:left="187" w:hanging="187"/>
       </w:pPr>
       <w:r>
-        <w:t>Managed approximately $130K in quarterly media and sponsorship spend; shifted budget toward webinars after finding that their cost per sales-accepted opportunity was 83% lower than paid digital.</w:t>
-      </w:r>
-    </w:p>
-    <w:p>
-      <w:pPr>
-        <w:pStyle w:val="ListBullet"/>
-        <w:widowControl/>
-        <w:spacing w:after="30"/>
-        <w:ind w:left="187" w:hanging="187"/>
-      </w:pPr>
-      <w:r>
-        <w:t>Directed AI-assisted research across 13 architecture, engineering, and construction sub-industries; recommended sector-specific positioning and built a sales-development playbook grounded in observable prospect signals.</w:t>
-      </w:r>
-    </w:p>
-    <w:p>
-      <w:pPr>
-        <w:pStyle w:val="ListBullet"/>
-        <w:widowControl/>
-        <w:spacing w:after="30"/>
-        <w:ind w:left="187" w:hanging="187"/>
-      </w:pPr>
-      <w:r>
         <w:t xml:space="preserve">Designed and fielded a 138-person survey and co-authored </w:t>
       </w:r>
       <w:hyperlink r:id="rId16">
@@ -381,6 +381,17 @@
           <w:sz w:val="19"/>
         </w:rPr>
         <w:t>Enterprise learning platform | Apr 2023 – Aug 2024</w:t>
+      </w:r>
+    </w:p>
+    <w:p>
+      <w:pPr>
+        <w:pStyle w:val="ListBullet"/>
+        <w:widowControl/>
+        <w:spacing w:after="30"/>
+        <w:ind w:left="187" w:hanging="187"/>
+      </w:pPr>
+      <w:r>
+        <w:t>Worked with Sales, Customer Experience, and Professional Services to turn customer use cases into deal-specific sales materials. Supported wins and expansions with Delta, 3M, Centene, Marriott, Capital Group, and IMD Business School.</w:t>
       </w:r>
     </w:p>
     <w:p>
@@ -482,7 +493,7 @@
         <w:ind w:left="187" w:hanging="187"/>
       </w:pPr>
       <w:r>
-        <w:t>Developed industry-specific positioning and packaging across manufacturing, hospitality, financial services, technology, healthcare, and energy. Co-built a market-sizing model estimating a ~$9B TAM and ~$1.4B mid-market opportunity.</w:t>
+        <w:t>Designed ROI research with Cascade Insights, including six executive interviews and a 127-person survey; translated customer-reported outcomes into a shared value framework for Sales and Customer Success.</w:t>
       </w:r>
     </w:p>
     <w:p>
@@ -493,7 +504,7 @@
         <w:ind w:left="187" w:hanging="187"/>
       </w:pPr>
       <w:r>
-        <w:t>Designed ROI research with Cascade Insights, including six executive interviews and a 127-person survey; translated customer-reported outcomes into a shared value framework for Sales and Customer Success.</w:t>
+        <w:t>Developed industry-specific positioning and packaging across manufacturing, hospitality, financial services, technology, healthcare, and energy. Co-built a market-sizing model estimating a ~$9B TAM and ~$1.4B mid-market opportunity.</w:t>
       </w:r>
     </w:p>
     <w:p>
@@ -718,101 +729,6 @@
             <w:color w:val="243B53"/>
             <w:u w:val="single"/>
           </w:rPr>
-          <w:t>Customer research tools</w:t>
-        </w:r>
-      </w:hyperlink>
-      <w:r>
-        <w:t>: Desktop Gong/Grain transcript downloader and Markdown merger, plus case-study agents that organize conversations by account, preserve source attribution, and produce drafts and quote exports.</w:t>
-      </w:r>
-    </w:p>
-    <w:p>
-      <w:pPr>
-        <w:pStyle w:val="ListBullet"/>
-        <w:widowControl/>
-        <w:spacing w:after="30"/>
-        <w:ind w:left="187" w:hanging="187"/>
-      </w:pPr>
-      <w:hyperlink r:id="rId22">
-        <w:r>
-          <w:rPr>
-            <w:sz w:val="21"/>
-            <w:color w:val="243B53"/>
-            <w:u w:val="single"/>
-          </w:rPr>
-          <w:t>Interactive product demos</w:t>
-        </w:r>
-      </w:hyperlink>
-      <w:r>
-        <w:t>: Liquid AI-inspired games and demos exploring on-device versus cloud AI, plus an Ashby-inspired recruiting game showing how data quality shapes decisions.</w:t>
-      </w:r>
-    </w:p>
-    <w:p>
-      <w:pPr>
-        <w:pStyle w:val="ListBullet"/>
-        <w:widowControl/>
-        <w:spacing w:after="30"/>
-        <w:ind w:left="187" w:hanging="187"/>
-      </w:pPr>
-      <w:hyperlink r:id="rId23">
-        <w:r>
-          <w:rPr>
-            <w:sz w:val="21"/>
-            <w:color w:val="243B53"/>
-            <w:u w:val="single"/>
-          </w:rPr>
-          <w:t>BlackRock Aladdin guide</w:t>
-        </w:r>
-      </w:hyperlink>
-      <w:r>
-        <w:t>: Interactive lessons and executive briefings translating public API specifications and product research into an explanation of the platform and its business value.</w:t>
-      </w:r>
-    </w:p>
-    <w:p>
-      <w:pPr>
-        <w:pStyle w:val="ListBullet"/>
-        <w:widowControl/>
-        <w:spacing w:after="30"/>
-        <w:ind w:left="187" w:hanging="187"/>
-      </w:pPr>
-      <w:hyperlink r:id="rId24">
-        <w:r>
-          <w:rPr>
-            <w:sz w:val="21"/>
-            <w:color w:val="243B53"/>
-            <w:u w:val="single"/>
-          </w:rPr>
-          <w:t>Etta</w:t>
-        </w:r>
-      </w:hyperlink>
-      <w:r>
-        <w:t>: Desktop learning app combining Claude-generated lessons and quizzes with prerequisite progression, mastery tracking, and spaced review, from algebra through astrophysics.</w:t>
-      </w:r>
-    </w:p>
-    <w:p>
-      <w:pPr>
-        <w:pStyle w:val="ListBullet"/>
-        <w:widowControl/>
-        <w:spacing w:after="30"/>
-        <w:ind w:left="187" w:hanging="187"/>
-      </w:pPr>
-      <w:r>
-        <w:t>Compute marketplace: Fixed-price AI-job workflows and a 517-company competitive dossier testing the business case for verified results and buyer recourse.</w:t>
-      </w:r>
-    </w:p>
-    <w:p>
-      <w:pPr>
-        <w:pStyle w:val="ListBullet"/>
-        <w:widowControl/>
-        <w:spacing w:after="30"/>
-        <w:ind w:left="187" w:hanging="187"/>
-      </w:pPr>
-      <w:hyperlink r:id="rId25">
-        <w:r>
-          <w:rPr>
-            <w:sz w:val="21"/>
-            <w:color w:val="243B53"/>
-            <w:u w:val="single"/>
-          </w:rPr>
           <w:t>Company research workflows</w:t>
         </w:r>
       </w:hyperlink>
@@ -838,19 +754,45 @@
         <w:spacing w:after="30"/>
         <w:ind w:left="187" w:hanging="187"/>
       </w:pPr>
-      <w:hyperlink r:id="rId26">
+      <w:r>
+        <w:t>Compute marketplace: Fixed-price AI-job workflows and a 517-company competitive dossier testing the business case for verified results and buyer recourse.</w:t>
+      </w:r>
+    </w:p>
+    <w:p>
+      <w:pPr>
+        <w:pStyle w:val="ListBullet"/>
+        <w:widowControl/>
+        <w:spacing w:after="30"/>
+        <w:ind w:left="187" w:hanging="187"/>
+      </w:pPr>
+      <w:hyperlink r:id="rId22">
         <w:r>
           <w:rPr>
             <w:sz w:val="21"/>
             <w:color w:val="243B53"/>
             <w:u w:val="single"/>
           </w:rPr>
-          <w:t>A&amp;E job board</w:t>
+          <w:t>Customer research tools</w:t>
         </w:r>
       </w:hyperlink>
       <w:r>
-        <w:t>: Automated job discovery, filtering, AI enrichment, and Webflow publishing, with stale-listing handling and a desktop monitoring app.</w:t>
+        <w:t>: Desktop Gong/Grain transcript downloader and Markdown merger, plus case-study agents that organize conversations by account, preserve source attribution, and produce drafts and quote exports.</w:t>
       </w:r>
+    </w:p>
+    <w:p>
+      <w:pPr>
+        <w:widowControl/>
+      </w:pPr>
+      <w:hyperlink r:id="rId23">
+        <w:r>
+          <w:rPr>
+            <w:sz w:val="21"/>
+            <w:color w:val="243B53"/>
+            <w:u w:val="single"/>
+          </w:rPr>
+          <w:t>Additional projects</w:t>
+        </w:r>
+      </w:hyperlink>
     </w:p>
     <w:p>
       <w:pPr>

</xml_diff>